<commit_message>
feat: add new template document for enhanced content formatting
</commit_message>
<xml_diff>
--- a/template/template_标题不编号-列表第二行缩进.docx
+++ b/template/template_标题不编号-列表第二行缩进.docx
@@ -137,18 +137,22 @@
       <w:bookmarkEnd w:id="3"/>
       <w:bookmarkEnd w:id="4"/>
       <w:bookmarkEnd w:id="5"/>
+      <w:proofErr w:type="spellStart"/>
       <w:r>
         <w:t>其他样式</w:t>
       </w:r>
+      <w:proofErr w:type="spellEnd"/>
     </w:p>
     <w:p>
       <w:pPr>
         <w:pStyle w:val="3"/>
       </w:pPr>
       <w:bookmarkStart w:id="7" w:name="正文"/>
+      <w:proofErr w:type="spellStart"/>
       <w:r>
         <w:t>正文</w:t>
       </w:r>
+      <w:proofErr w:type="spellEnd"/>
     </w:p>
     <w:p>
       <w:pPr>
@@ -272,12 +276,14 @@
       <w:bookmarkStart w:id="9" w:name="Xc37fb3293d6aee3816a7d458c1d9225e366ee70"/>
       <w:bookmarkStart w:id="10" w:name="超链接"/>
       <w:bookmarkEnd w:id="8"/>
+      <w:proofErr w:type="spellStart"/>
       <w:r>
         <w:rPr>
           <w:rFonts w:hint="eastAsia"/>
         </w:rPr>
         <w:t>有序列表</w:t>
       </w:r>
+      <w:proofErr w:type="spellEnd"/>
     </w:p>
     <w:p>
       <w:pPr>
@@ -527,12 +533,14 @@
       <w:bookmarkStart w:id="16" w:name="X485da3cdc3607fd788ed822705cf7db61c16e9c"/>
       <w:bookmarkEnd w:id="9"/>
       <w:bookmarkEnd w:id="15"/>
+      <w:proofErr w:type="spellStart"/>
       <w:r>
         <w:rPr>
           <w:rFonts w:hint="eastAsia"/>
         </w:rPr>
         <w:t>无序列表</w:t>
       </w:r>
+      <w:proofErr w:type="spellEnd"/>
     </w:p>
     <w:p>
       <w:pPr>
@@ -799,14 +807,14 @@
       <w:hyperlink r:id="rId8">
         <w:r>
           <w:rPr>
-            <w:rStyle w:val="ae"/>
+            <w:rStyle w:val="af"/>
           </w:rPr>
           <w:t>Achuan-2</w:t>
         </w:r>
         <w:proofErr w:type="gramStart"/>
         <w:r>
           <w:rPr>
-            <w:rStyle w:val="ae"/>
+            <w:rStyle w:val="af"/>
           </w:rPr>
           <w:t>的博客</w:t>
         </w:r>
@@ -926,6 +934,7 @@
         </w:rPr>
         <w:t>(</w:t>
       </w:r>
+      <w:proofErr w:type="spellStart"/>
       <w:proofErr w:type="gramStart"/>
       <w:r>
         <w:rPr>
@@ -1010,6 +1019,7 @@
         </w:rPr>
         <w:t>_max</w:t>
       </w:r>
+      <w:proofErr w:type="spellEnd"/>
       <w:r>
         <w:rPr>
           <w:rFonts w:ascii="Consolas" w:eastAsiaTheme="minorEastAsia" w:hAnsi="Consolas"/>
@@ -1087,6 +1097,7 @@
         </w:rPr>
         <w:t>(</w:t>
       </w:r>
+      <w:proofErr w:type="spellStart"/>
       <w:proofErr w:type="gramStart"/>
       <w:r>
         <w:rPr>
@@ -1129,6 +1140,7 @@
         </w:rPr>
         <w:t>_min</w:t>
       </w:r>
+      <w:proofErr w:type="spellEnd"/>
       <w:proofErr w:type="gramStart"/>
       <w:r>
         <w:rPr>
@@ -1149,6 +1161,7 @@
         </w:rPr>
         <w:t>,</w:t>
       </w:r>
+      <w:proofErr w:type="spellStart"/>
       <w:r>
         <w:rPr>
           <w:rFonts w:ascii="Consolas" w:eastAsiaTheme="minorEastAsia" w:hAnsi="Consolas"/>
@@ -1170,6 +1183,7 @@
         </w:rPr>
         <w:t>_max</w:t>
       </w:r>
+      <w:proofErr w:type="spellEnd"/>
       <w:r>
         <w:rPr>
           <w:rFonts w:ascii="Consolas" w:eastAsiaTheme="minorEastAsia" w:hAnsi="Consolas"/>
@@ -1221,19 +1235,41 @@
       <w:r>
         <w:t xml:space="preserve"> </w:t>
       </w:r>
+      <w:proofErr w:type="spellStart"/>
       <w:proofErr w:type="gramStart"/>
       <w:r>
         <w:rPr>
           <w:rStyle w:val="InlineCode"/>
         </w:rPr>
-        <w:t>disp(</w:t>
+        <w:t>disp</w:t>
+      </w:r>
+      <w:proofErr w:type="spellEnd"/>
+      <w:r>
+        <w:rPr>
+          <w:rStyle w:val="InlineCode"/>
+        </w:rPr>
+        <w:t>(</w:t>
       </w:r>
       <w:proofErr w:type="gramEnd"/>
       <w:r>
         <w:rPr>
           <w:rStyle w:val="InlineCode"/>
         </w:rPr>
-        <w:t>"Hello Matlab")</w:t>
+        <w:t xml:space="preserve">"Hello </w:t>
+      </w:r>
+      <w:proofErr w:type="spellStart"/>
+      <w:r>
+        <w:rPr>
+          <w:rStyle w:val="InlineCode"/>
+        </w:rPr>
+        <w:t>Matlab</w:t>
+      </w:r>
+      <w:proofErr w:type="spellEnd"/>
+      <w:r>
+        <w:rPr>
+          <w:rStyle w:val="InlineCode"/>
+        </w:rPr>
+        <w:t>")</w:t>
       </w:r>
     </w:p>
     <w:p>
@@ -1242,9 +1278,11 @@
       </w:pPr>
       <w:bookmarkStart w:id="23" w:name="表格"/>
       <w:bookmarkEnd w:id="22"/>
+      <w:proofErr w:type="spellStart"/>
       <w:r>
         <w:t>表格</w:t>
       </w:r>
+      <w:proofErr w:type="spellEnd"/>
     </w:p>
     <w:p>
       <w:pPr>
@@ -1362,9 +1400,11 @@
       <w:bookmarkStart w:id="25" w:name="引述块样式"/>
       <w:bookmarkEnd w:id="23"/>
       <w:bookmarkEnd w:id="24"/>
+      <w:proofErr w:type="spellStart"/>
       <w:r>
         <w:t>引述块样式</w:t>
       </w:r>
+      <w:proofErr w:type="spellEnd"/>
     </w:p>
     <w:p>
       <w:pPr>
@@ -1477,11 +1517,10 @@
         <w:docPartUnique/>
       </w:docPartObj>
     </w:sdtPr>
-    <w:sdtEndPr/>
     <w:sdtContent>
       <w:p>
         <w:pPr>
-          <w:pStyle w:val="af1"/>
+          <w:pStyle w:val="af2"/>
           <w:jc w:val="center"/>
         </w:pPr>
         <w:r>
@@ -1507,7 +1546,7 @@
   </w:sdt>
   <w:p>
     <w:pPr>
-      <w:pStyle w:val="af1"/>
+      <w:pStyle w:val="af2"/>
     </w:pPr>
   </w:p>
 </w:ftr>
@@ -3058,10 +3097,11 @@
   </w:style>
   <w:style w:type="table" w:customStyle="1" w:styleId="Table">
     <w:name w:val="Table"/>
+    <w:basedOn w:val="ab"/>
     <w:semiHidden/>
     <w:unhideWhenUsed/>
     <w:qFormat/>
-    <w:rsid w:val="004F42FD"/>
+    <w:rsid w:val="002D7FA2"/>
     <w:pPr>
       <w:jc w:val="center"/>
     </w:pPr>
@@ -3073,17 +3113,6 @@
     </w:rPr>
     <w:tblPr>
       <w:jc w:val="center"/>
-      <w:tblInd w:w="0" w:type="dxa"/>
-      <w:tblBorders>
-        <w:top w:val="single" w:sz="12" w:space="0" w:color="auto"/>
-        <w:bottom w:val="single" w:sz="12" w:space="0" w:color="auto"/>
-      </w:tblBorders>
-      <w:tblCellMar>
-        <w:top w:w="0" w:type="dxa"/>
-        <w:left w:w="108" w:type="dxa"/>
-        <w:bottom w:w="0" w:type="dxa"/>
-        <w:right w:w="108" w:type="dxa"/>
-      </w:tblCellMar>
     </w:tblPr>
     <w:trPr>
       <w:jc w:val="center"/>
@@ -3121,10 +3150,10 @@
     <w:name w:val="Definition"/>
     <w:basedOn w:val="a"/>
   </w:style>
-  <w:style w:type="paragraph" w:styleId="ab">
+  <w:style w:type="paragraph" w:styleId="ac">
     <w:name w:val="caption"/>
     <w:basedOn w:val="a"/>
-    <w:link w:val="ac"/>
+    <w:link w:val="ad"/>
     <w:rsid w:val="005D0F42"/>
     <w:pPr>
       <w:spacing w:after="120"/>
@@ -3133,14 +3162,14 @@
   </w:style>
   <w:style w:type="paragraph" w:customStyle="1" w:styleId="TableCaption">
     <w:name w:val="Table Caption"/>
-    <w:basedOn w:val="ab"/>
+    <w:basedOn w:val="ac"/>
     <w:pPr>
       <w:keepNext/>
     </w:pPr>
   </w:style>
   <w:style w:type="paragraph" w:customStyle="1" w:styleId="ImageCaption">
     <w:name w:val="Image Caption"/>
-    <w:basedOn w:val="ab"/>
+    <w:basedOn w:val="ac"/>
   </w:style>
   <w:style w:type="paragraph" w:customStyle="1" w:styleId="Figure">
     <w:name w:val="Figure"/>
@@ -3158,10 +3187,10 @@
       <w:keepNext/>
     </w:pPr>
   </w:style>
-  <w:style w:type="character" w:customStyle="1" w:styleId="ac">
+  <w:style w:type="character" w:customStyle="1" w:styleId="ad">
     <w:name w:val="题注 字符"/>
     <w:basedOn w:val="a1"/>
-    <w:link w:val="ab"/>
+    <w:link w:val="ac"/>
     <w:rsid w:val="005D0F42"/>
     <w:rPr>
       <w:rFonts w:ascii="Times New Roman" w:eastAsia="宋体" w:hAnsi="Times New Roman"/>
@@ -3169,7 +3198,7 @@
   </w:style>
   <w:style w:type="character" w:customStyle="1" w:styleId="VerbatimChar">
     <w:name w:val="Verbatim Char"/>
-    <w:basedOn w:val="ac"/>
+    <w:basedOn w:val="ad"/>
     <w:link w:val="SourceCode"/>
     <w:rsid w:val="00BF2EFB"/>
     <w:rPr>
@@ -3180,17 +3209,17 @@
       <w:lang w:eastAsia="zh-CN"/>
     </w:rPr>
   </w:style>
-  <w:style w:type="character" w:styleId="ad">
+  <w:style w:type="character" w:styleId="ae">
     <w:name w:val="footnote reference"/>
-    <w:basedOn w:val="ac"/>
+    <w:basedOn w:val="ad"/>
     <w:rPr>
       <w:rFonts w:ascii="Times New Roman" w:eastAsia="宋体" w:hAnsi="Times New Roman"/>
       <w:vertAlign w:val="superscript"/>
     </w:rPr>
   </w:style>
-  <w:style w:type="character" w:styleId="ae">
+  <w:style w:type="character" w:styleId="af">
     <w:name w:val="Hyperlink"/>
-    <w:basedOn w:val="ac"/>
+    <w:basedOn w:val="ad"/>
     <w:rsid w:val="000C100F"/>
     <w:rPr>
       <w:rFonts w:ascii="Times New Roman" w:eastAsia="宋体" w:hAnsi="Times New Roman"/>
@@ -3249,10 +3278,10 @@
       <w:lang w:eastAsia="zh-CN"/>
     </w:rPr>
   </w:style>
-  <w:style w:type="paragraph" w:styleId="af">
+  <w:style w:type="paragraph" w:styleId="af0">
     <w:name w:val="header"/>
     <w:basedOn w:val="a"/>
-    <w:link w:val="af0"/>
+    <w:link w:val="af1"/>
     <w:rsid w:val="00797A2D"/>
     <w:pPr>
       <w:tabs>
@@ -3267,20 +3296,20 @@
       <w:szCs w:val="18"/>
     </w:rPr>
   </w:style>
-  <w:style w:type="character" w:customStyle="1" w:styleId="af0">
+  <w:style w:type="character" w:customStyle="1" w:styleId="af1">
     <w:name w:val="页眉 字符"/>
     <w:basedOn w:val="a1"/>
-    <w:link w:val="af"/>
+    <w:link w:val="af0"/>
     <w:rsid w:val="00797A2D"/>
     <w:rPr>
       <w:sz w:val="18"/>
       <w:szCs w:val="18"/>
     </w:rPr>
   </w:style>
-  <w:style w:type="paragraph" w:styleId="af1">
+  <w:style w:type="paragraph" w:styleId="af2">
     <w:name w:val="footer"/>
     <w:basedOn w:val="a"/>
-    <w:link w:val="af2"/>
+    <w:link w:val="af3"/>
     <w:uiPriority w:val="99"/>
     <w:rsid w:val="00797A2D"/>
     <w:pPr>
@@ -3295,10 +3324,10 @@
       <w:szCs w:val="18"/>
     </w:rPr>
   </w:style>
-  <w:style w:type="character" w:customStyle="1" w:styleId="af2">
+  <w:style w:type="character" w:customStyle="1" w:styleId="af3">
     <w:name w:val="页脚 字符"/>
     <w:basedOn w:val="a1"/>
-    <w:link w:val="af1"/>
+    <w:link w:val="af2"/>
     <w:uiPriority w:val="99"/>
     <w:rsid w:val="00797A2D"/>
     <w:rPr>
@@ -3326,7 +3355,7 @@
       </w:numPr>
     </w:pPr>
   </w:style>
-  <w:style w:type="paragraph" w:customStyle="1" w:styleId="af3">
+  <w:style w:type="paragraph" w:customStyle="1" w:styleId="af4">
     <w:name w:val="图片"/>
     <w:basedOn w:val="FirstParagraph"/>
     <w:qFormat/>
@@ -3398,6 +3427,26 @@
       <w:shd w:val="clear" w:color="F3F4F4" w:fill="F2F2F2" w:themeFill="background1" w:themeFillShade="F2"/>
       <w:lang w:eastAsia="zh-CN"/>
     </w:rPr>
+  </w:style>
+  <w:style w:type="table" w:styleId="ab">
+    <w:name w:val="Table Theme"/>
+    <w:basedOn w:val="a2"/>
+    <w:semiHidden/>
+    <w:unhideWhenUsed/>
+    <w:rsid w:val="002D7FA2"/>
+    <w:pPr>
+      <w:spacing w:after="0" w:line="360" w:lineRule="auto"/>
+    </w:pPr>
+    <w:tblPr>
+      <w:tblBorders>
+        <w:top w:val="single" w:sz="4" w:space="0" w:color="auto"/>
+        <w:left w:val="single" w:sz="4" w:space="0" w:color="auto"/>
+        <w:bottom w:val="single" w:sz="4" w:space="0" w:color="auto"/>
+        <w:right w:val="single" w:sz="4" w:space="0" w:color="auto"/>
+        <w:insideH w:val="single" w:sz="4" w:space="0" w:color="auto"/>
+        <w:insideV w:val="single" w:sz="4" w:space="0" w:color="auto"/>
+      </w:tblBorders>
+    </w:tblPr>
   </w:style>
 </w:styles>
 </file>

</xml_diff>